<commit_message>
fiizxed warp of code chunks to 65 characters
</commit_message>
<xml_diff>
--- a/docs/common_code/01_libraries/libraries.docx
+++ b/docs/common_code/01_libraries/libraries.docx
@@ -240,7 +240,22 @@
         <w:rPr>
           <w:rStyle w:val="CommentTok"/>
         </w:rPr>
-        <w:t xml:space="preserve"># dplyr, ggplot2, tidyr, purrr, readr, stringr, forcats</w:t>
+        <w:t xml:space="preserve"># dplyr, ggplot2, tidyr, purrr,</w:t>
+      </w:r>
+      <w:r>
+        <w:br/>
+      </w:r>
+      <w:r>
+        <w:rPr>
+          <w:rStyle w:val="NormalTok"/>
+        </w:rPr>
+        <w:t xml:space="preserve">                                 </w:t>
+      </w:r>
+      <w:r>
+        <w:rPr>
+          <w:rStyle w:val="CommentTok"/>
+        </w:rPr>
+        <w:t xml:space="preserve"># readr, stringr, forcats</w:t>
       </w:r>
       <w:r>
         <w:br/>
@@ -306,7 +321,22 @@
         <w:rPr>
           <w:rStyle w:val="CommentTok"/>
         </w:rPr>
-        <w:t xml:space="preserve"># read Excel (.xlsx / .xls) files into R</w:t>
+        <w:t xml:space="preserve"># read Excel (.xlsx /</w:t>
+      </w:r>
+      <w:r>
+        <w:br/>
+      </w:r>
+      <w:r>
+        <w:rPr>
+          <w:rStyle w:val="NormalTok"/>
+        </w:rPr>
+        <w:t xml:space="preserve">                                 </w:t>
+      </w:r>
+      <w:r>
+        <w:rPr>
+          <w:rStyle w:val="CommentTok"/>
+        </w:rPr>
+        <w:t xml:space="preserve"># .xls) files into R</w:t>
       </w:r>
       <w:r>
         <w:br/>
@@ -339,7 +369,22 @@
         <w:rPr>
           <w:rStyle w:val="CommentTok"/>
         </w:rPr>
-        <w:t xml:space="preserve"># write data frames back out to Excel</w:t>
+        <w:t xml:space="preserve"># write data frames</w:t>
+      </w:r>
+      <w:r>
+        <w:br/>
+      </w:r>
+      <w:r>
+        <w:rPr>
+          <w:rStyle w:val="NormalTok"/>
+        </w:rPr>
+        <w:t xml:space="preserve">                                 </w:t>
+      </w:r>
+      <w:r>
+        <w:rPr>
+          <w:rStyle w:val="CommentTok"/>
+        </w:rPr>
+        <w:t xml:space="preserve"># back out to Excel</w:t>
       </w:r>
       <w:r>
         <w:br/>
@@ -372,7 +417,22 @@
         <w:rPr>
           <w:rStyle w:val="CommentTok"/>
         </w:rPr>
-        <w:t xml:space="preserve"># clean messy column names and tabulate data</w:t>
+        <w:t xml:space="preserve"># clean messy column</w:t>
+      </w:r>
+      <w:r>
+        <w:br/>
+      </w:r>
+      <w:r>
+        <w:rPr>
+          <w:rStyle w:val="NormalTok"/>
+        </w:rPr>
+        <w:t xml:space="preserve">                                 </w:t>
+      </w:r>
+      <w:r>
+        <w:rPr>
+          <w:rStyle w:val="CommentTok"/>
+        </w:rPr>
+        <w:t xml:space="preserve"># names and tabulate data</w:t>
       </w:r>
       <w:r>
         <w:br/>
@@ -405,7 +465,22 @@
         <w:rPr>
           <w:rStyle w:val="CommentTok"/>
         </w:rPr>
-        <w:t xml:space="preserve"># quick, readable summary statistics</w:t>
+        <w:t xml:space="preserve"># quick, readable</w:t>
+      </w:r>
+      <w:r>
+        <w:br/>
+      </w:r>
+      <w:r>
+        <w:rPr>
+          <w:rStyle w:val="NormalTok"/>
+        </w:rPr>
+        <w:t xml:space="preserve">                                 </w:t>
+      </w:r>
+      <w:r>
+        <w:rPr>
+          <w:rStyle w:val="CommentTok"/>
+        </w:rPr>
+        <w:t xml:space="preserve"># summary statistics</w:t>
       </w:r>
       <w:r>
         <w:br/>
@@ -438,7 +513,22 @@
         <w:rPr>
           <w:rStyle w:val="CommentTok"/>
         </w:rPr>
-        <w:t xml:space="preserve"># paste strings together cleanly with {variable} syntax</w:t>
+        <w:t xml:space="preserve"># paste strings together cleanly</w:t>
+      </w:r>
+      <w:r>
+        <w:br/>
+      </w:r>
+      <w:r>
+        <w:rPr>
+          <w:rStyle w:val="NormalTok"/>
+        </w:rPr>
+        <w:t xml:space="preserve">                                 </w:t>
+      </w:r>
+      <w:r>
+        <w:rPr>
+          <w:rStyle w:val="CommentTok"/>
+        </w:rPr>
+        <w:t xml:space="preserve"># with {variable} syntax</w:t>
       </w:r>
       <w:r>
         <w:br/>
@@ -471,7 +561,22 @@
         <w:rPr>
           <w:rStyle w:val="CommentTok"/>
         </w:rPr>
-        <w:t xml:space="preserve"># install packages from GitHub and other sources</w:t>
+        <w:t xml:space="preserve"># install packages from</w:t>
+      </w:r>
+      <w:r>
+        <w:br/>
+      </w:r>
+      <w:r>
+        <w:rPr>
+          <w:rStyle w:val="NormalTok"/>
+        </w:rPr>
+        <w:t xml:space="preserve">                                 </w:t>
+      </w:r>
+      <w:r>
+        <w:rPr>
+          <w:rStyle w:val="CommentTok"/>
+        </w:rPr>
+        <w:t xml:space="preserve"># GitHub and other sources</w:t>
       </w:r>
       <w:r>
         <w:br/>
@@ -504,7 +609,22 @@
         <w:rPr>
           <w:rStyle w:val="CommentTok"/>
         </w:rPr>
-        <w:t xml:space="preserve"># lighter alternative to devtools for GitHub installs</w:t>
+        <w:t xml:space="preserve"># lighter alternative to</w:t>
+      </w:r>
+      <w:r>
+        <w:br/>
+      </w:r>
+      <w:r>
+        <w:rPr>
+          <w:rStyle w:val="NormalTok"/>
+        </w:rPr>
+        <w:t xml:space="preserve">                                 </w:t>
+      </w:r>
+      <w:r>
+        <w:rPr>
+          <w:rStyle w:val="CommentTok"/>
+        </w:rPr>
+        <w:t xml:space="preserve"># devtools for GitHub installs</w:t>
       </w:r>
     </w:p>
     <w:bookmarkStart w:id="11" w:name="what-you-load-each-session"/>
@@ -536,7 +656,22 @@
         <w:rPr>
           <w:rStyle w:val="CommentTok"/>
         </w:rPr>
-        <w:t xml:space="preserve"># loads dplyr, ggplot2, tidyr, readr, purrr, stringr, forcats</w:t>
+        <w:t xml:space="preserve"># loads dplyr, ggplot2, tidyr,</w:t>
+      </w:r>
+      <w:r>
+        <w:br/>
+      </w:r>
+      <w:r>
+        <w:rPr>
+          <w:rStyle w:val="NormalTok"/>
+        </w:rPr>
+        <w:t xml:space="preserve">                     </w:t>
+      </w:r>
+      <w:r>
+        <w:rPr>
+          <w:rStyle w:val="CommentTok"/>
+        </w:rPr>
+        <w:t xml:space="preserve"># readr, purrr, stringr, forcats</w:t>
       </w:r>
       <w:r>
         <w:br/>
@@ -711,7 +846,22 @@
         <w:rPr>
           <w:rStyle w:val="CommentTok"/>
         </w:rPr>
-        <w:t xml:space="preserve"># combine multiple ggplot panels into one figure</w:t>
+        <w:t xml:space="preserve"># combine multiple ggplot</w:t>
+      </w:r>
+      <w:r>
+        <w:br/>
+      </w:r>
+      <w:r>
+        <w:rPr>
+          <w:rStyle w:val="NormalTok"/>
+        </w:rPr>
+        <w:t xml:space="preserve">                                 </w:t>
+      </w:r>
+      <w:r>
+        <w:rPr>
+          <w:rStyle w:val="CommentTok"/>
+        </w:rPr>
+        <w:t xml:space="preserve"># panels into one figure</w:t>
       </w:r>
       <w:r>
         <w:br/>
@@ -744,7 +894,22 @@
         <w:rPr>
           <w:rStyle w:val="CommentTok"/>
         </w:rPr>
-        <w:t xml:space="preserve"># fine-grained control of axis breaks, labels, and colours</w:t>
+        <w:t xml:space="preserve"># fine-grained control of axis</w:t>
+      </w:r>
+      <w:r>
+        <w:br/>
+      </w:r>
+      <w:r>
+        <w:rPr>
+          <w:rStyle w:val="NormalTok"/>
+        </w:rPr>
+        <w:t xml:space="preserve">                                 </w:t>
+      </w:r>
+      <w:r>
+        <w:rPr>
+          <w:rStyle w:val="CommentTok"/>
+        </w:rPr>
+        <w:t xml:space="preserve"># breaks, labels, and colours</w:t>
       </w:r>
       <w:r>
         <w:br/>
@@ -777,7 +942,37 @@
         <w:rPr>
           <w:rStyle w:val="CommentTok"/>
         </w:rPr>
-        <w:t xml:space="preserve"># extra complete themes (Economist, FiveThirtyEight, etc.)</w:t>
+        <w:t xml:space="preserve"># extra complete themes</w:t>
+      </w:r>
+      <w:r>
+        <w:br/>
+      </w:r>
+      <w:r>
+        <w:rPr>
+          <w:rStyle w:val="NormalTok"/>
+        </w:rPr>
+        <w:t xml:space="preserve">                                 </w:t>
+      </w:r>
+      <w:r>
+        <w:rPr>
+          <w:rStyle w:val="CommentTok"/>
+        </w:rPr>
+        <w:t xml:space="preserve"># (Economist,</w:t>
+      </w:r>
+      <w:r>
+        <w:br/>
+      </w:r>
+      <w:r>
+        <w:rPr>
+          <w:rStyle w:val="NormalTok"/>
+        </w:rPr>
+        <w:t xml:space="preserve">                                 </w:t>
+      </w:r>
+      <w:r>
+        <w:rPr>
+          <w:rStyle w:val="CommentTok"/>
+        </w:rPr>
+        <w:t xml:space="preserve"># FiveThirtyEight, etc.)</w:t>
       </w:r>
       <w:r>
         <w:br/>
@@ -810,7 +1005,22 @@
         <w:rPr>
           <w:rStyle w:val="CommentTok"/>
         </w:rPr>
-        <w:t xml:space="preserve"># ridge / joy plots for overlapping distributions</w:t>
+        <w:t xml:space="preserve"># ridge / joy plots for</w:t>
+      </w:r>
+      <w:r>
+        <w:br/>
+      </w:r>
+      <w:r>
+        <w:rPr>
+          <w:rStyle w:val="NormalTok"/>
+        </w:rPr>
+        <w:t xml:space="preserve">                                 </w:t>
+      </w:r>
+      <w:r>
+        <w:rPr>
+          <w:rStyle w:val="CommentTok"/>
+        </w:rPr>
+        <w:t xml:space="preserve"># overlapping distributions</w:t>
       </w:r>
       <w:r>
         <w:br/>
@@ -843,7 +1053,22 @@
         <w:rPr>
           <w:rStyle w:val="CommentTok"/>
         </w:rPr>
-        <w:t xml:space="preserve"># publication-ready figures; add p-value brackets to plots</w:t>
+        <w:t xml:space="preserve"># publication-ready figures;</w:t>
+      </w:r>
+      <w:r>
+        <w:br/>
+      </w:r>
+      <w:r>
+        <w:rPr>
+          <w:rStyle w:val="NormalTok"/>
+        </w:rPr>
+        <w:t xml:space="preserve">                                 </w:t>
+      </w:r>
+      <w:r>
+        <w:rPr>
+          <w:rStyle w:val="CommentTok"/>
+        </w:rPr>
+        <w:t xml:space="preserve"># add p-value brackets to plots</w:t>
       </w:r>
     </w:p>
     <w:bookmarkEnd w:id="13"/>
@@ -888,7 +1113,22 @@
         <w:rPr>
           <w:rStyle w:val="CommentTok"/>
         </w:rPr>
-        <w:t xml:space="preserve"># perceptually uniform, colour-blind-safe palettes</w:t>
+        <w:t xml:space="preserve"># perceptually uniform,</w:t>
+      </w:r>
+      <w:r>
+        <w:br/>
+      </w:r>
+      <w:r>
+        <w:rPr>
+          <w:rStyle w:val="NormalTok"/>
+        </w:rPr>
+        <w:t xml:space="preserve">                                 </w:t>
+      </w:r>
+      <w:r>
+        <w:rPr>
+          <w:rStyle w:val="CommentTok"/>
+        </w:rPr>
+        <w:t xml:space="preserve"># colour-blind-safe palettes</w:t>
       </w:r>
       <w:r>
         <w:br/>
@@ -921,7 +1161,22 @@
         <w:rPr>
           <w:rStyle w:val="CommentTok"/>
         </w:rPr>
-        <w:t xml:space="preserve"># render markdown / HTML inside plot text and labels</w:t>
+        <w:t xml:space="preserve"># render markdown / HTML</w:t>
+      </w:r>
+      <w:r>
+        <w:br/>
+      </w:r>
+      <w:r>
+        <w:rPr>
+          <w:rStyle w:val="NormalTok"/>
+        </w:rPr>
+        <w:t xml:space="preserve">                                 </w:t>
+      </w:r>
+      <w:r>
+        <w:rPr>
+          <w:rStyle w:val="CommentTok"/>
+        </w:rPr>
+        <w:t xml:space="preserve"># inside plot text and labels</w:t>
       </w:r>
       <w:r>
         <w:br/>
@@ -954,7 +1209,22 @@
         <w:rPr>
           <w:rStyle w:val="CommentTok"/>
         </w:rPr>
-        <w:t xml:space="preserve"># use Google Fonts and custom fonts in ggplot</w:t>
+        <w:t xml:space="preserve"># use Google Fonts and</w:t>
+      </w:r>
+      <w:r>
+        <w:br/>
+      </w:r>
+      <w:r>
+        <w:rPr>
+          <w:rStyle w:val="NormalTok"/>
+        </w:rPr>
+        <w:t xml:space="preserve">                                 </w:t>
+      </w:r>
+      <w:r>
+        <w:rPr>
+          <w:rStyle w:val="CommentTok"/>
+        </w:rPr>
+        <w:t xml:space="preserve"># custom fonts in ggplot</w:t>
       </w:r>
       <w:r>
         <w:br/>
@@ -987,7 +1257,22 @@
         <w:rPr>
           <w:rStyle w:val="CommentTok"/>
         </w:rPr>
-        <w:t xml:space="preserve"># fast, high-quality PNG/TIFF rendering device</w:t>
+        <w:t xml:space="preserve"># fast, high-quality</w:t>
+      </w:r>
+      <w:r>
+        <w:br/>
+      </w:r>
+      <w:r>
+        <w:rPr>
+          <w:rStyle w:val="NormalTok"/>
+        </w:rPr>
+        <w:t xml:space="preserve">                                 </w:t>
+      </w:r>
+      <w:r>
+        <w:rPr>
+          <w:rStyle w:val="CommentTok"/>
+        </w:rPr>
+        <w:t xml:space="preserve"># PNG/TIFF rendering device</w:t>
       </w:r>
     </w:p>
     <w:bookmarkEnd w:id="14"/>
@@ -1032,7 +1317,22 @@
         <w:rPr>
           <w:rStyle w:val="CommentTok"/>
         </w:rPr>
-        <w:t xml:space="preserve"># turn any ggplot into an interactive HTML figure</w:t>
+        <w:t xml:space="preserve"># turn any ggplot into an</w:t>
+      </w:r>
+      <w:r>
+        <w:br/>
+      </w:r>
+      <w:r>
+        <w:rPr>
+          <w:rStyle w:val="NormalTok"/>
+        </w:rPr>
+        <w:t xml:space="preserve">                                 </w:t>
+      </w:r>
+      <w:r>
+        <w:rPr>
+          <w:rStyle w:val="CommentTok"/>
+        </w:rPr>
+        <w:t xml:space="preserve"># interactive HTML figure</w:t>
       </w:r>
       <w:r>
         <w:br/>
@@ -1065,7 +1365,22 @@
         <w:rPr>
           <w:rStyle w:val="CommentTok"/>
         </w:rPr>
-        <w:t xml:space="preserve"># add tooltips and click interactions to ggplot geoms</w:t>
+        <w:t xml:space="preserve"># add tooltips and click</w:t>
+      </w:r>
+      <w:r>
+        <w:br/>
+      </w:r>
+      <w:r>
+        <w:rPr>
+          <w:rStyle w:val="NormalTok"/>
+        </w:rPr>
+        <w:t xml:space="preserve">                                 </w:t>
+      </w:r>
+      <w:r>
+        <w:rPr>
+          <w:rStyle w:val="CommentTok"/>
+        </w:rPr>
+        <w:t xml:space="preserve"># interactions to ggplot geoms</w:t>
       </w:r>
       <w:r>
         <w:br/>
@@ -1098,7 +1413,22 @@
         <w:rPr>
           <w:rStyle w:val="CommentTok"/>
         </w:rPr>
-        <w:t xml:space="preserve"># animate ggplots (requires gifski or av for output)</w:t>
+        <w:t xml:space="preserve"># animate ggplots (requires</w:t>
+      </w:r>
+      <w:r>
+        <w:br/>
+      </w:r>
+      <w:r>
+        <w:rPr>
+          <w:rStyle w:val="NormalTok"/>
+        </w:rPr>
+        <w:t xml:space="preserve">                                 </w:t>
+      </w:r>
+      <w:r>
+        <w:rPr>
+          <w:rStyle w:val="CommentTok"/>
+        </w:rPr>
+        <w:t xml:space="preserve"># gifski or av for output)</w:t>
       </w:r>
       <w:r>
         <w:br/>
@@ -1164,7 +1494,22 @@
         <w:rPr>
           <w:rStyle w:val="CommentTok"/>
         </w:rPr>
-        <w:t xml:space="preserve"># render gganimate output as MP4 video</w:t>
+        <w:t xml:space="preserve"># render gganimate</w:t>
+      </w:r>
+      <w:r>
+        <w:br/>
+      </w:r>
+      <w:r>
+        <w:rPr>
+          <w:rStyle w:val="NormalTok"/>
+        </w:rPr>
+        <w:t xml:space="preserve">                                 </w:t>
+      </w:r>
+      <w:r>
+        <w:rPr>
+          <w:rStyle w:val="CommentTok"/>
+        </w:rPr>
+        <w:t xml:space="preserve"># output as MP4 video</w:t>
       </w:r>
     </w:p>
     <w:bookmarkEnd w:id="15"/>
@@ -1209,7 +1554,22 @@
         <w:rPr>
           <w:rStyle w:val="CommentTok"/>
         </w:rPr>
-        <w:t xml:space="preserve"># preview a plot at exact export dimensions before saving</w:t>
+        <w:t xml:space="preserve"># preview a plot at exact export</w:t>
+      </w:r>
+      <w:r>
+        <w:br/>
+      </w:r>
+      <w:r>
+        <w:rPr>
+          <w:rStyle w:val="NormalTok"/>
+        </w:rPr>
+        <w:t xml:space="preserve">                                 </w:t>
+      </w:r>
+      <w:r>
+        <w:rPr>
+          <w:rStyle w:val="CommentTok"/>
+        </w:rPr>
+        <w:t xml:space="preserve"># dimensions before saving</w:t>
       </w:r>
     </w:p>
     <w:p>
@@ -1270,7 +1630,22 @@
         <w:rPr>
           <w:rStyle w:val="CommentTok"/>
         </w:rPr>
-        <w:t xml:space="preserve"># publication tables that export cleanly to Word and PowerPoint</w:t>
+        <w:t xml:space="preserve"># publication tables that export</w:t>
+      </w:r>
+      <w:r>
+        <w:br/>
+      </w:r>
+      <w:r>
+        <w:rPr>
+          <w:rStyle w:val="NormalTok"/>
+        </w:rPr>
+        <w:t xml:space="preserve">                                 </w:t>
+      </w:r>
+      <w:r>
+        <w:rPr>
+          <w:rStyle w:val="CommentTok"/>
+        </w:rPr>
+        <w:t xml:space="preserve"># cleanly to Word and PowerPoint</w:t>
       </w:r>
       <w:r>
         <w:br/>
@@ -1303,7 +1678,22 @@
         <w:rPr>
           <w:rStyle w:val="CommentTok"/>
         </w:rPr>
-        <w:t xml:space="preserve"># grammar-of-tables: highly customisable HTML/PDF tables</w:t>
+        <w:t xml:space="preserve"># grammar-of-tables: highly</w:t>
+      </w:r>
+      <w:r>
+        <w:br/>
+      </w:r>
+      <w:r>
+        <w:rPr>
+          <w:rStyle w:val="NormalTok"/>
+        </w:rPr>
+        <w:t xml:space="preserve">                                 </w:t>
+      </w:r>
+      <w:r>
+        <w:rPr>
+          <w:rStyle w:val="CommentTok"/>
+        </w:rPr>
+        <w:t xml:space="preserve"># customisable HTML/PDF tables</w:t>
       </w:r>
       <w:r>
         <w:br/>
@@ -1336,7 +1726,22 @@
         <w:rPr>
           <w:rStyle w:val="CommentTok"/>
         </w:rPr>
-        <w:t xml:space="preserve"># kable() for simple tables inside Quarto documents</w:t>
+        <w:t xml:space="preserve"># kable() for simple tables</w:t>
+      </w:r>
+      <w:r>
+        <w:br/>
+      </w:r>
+      <w:r>
+        <w:rPr>
+          <w:rStyle w:val="NormalTok"/>
+        </w:rPr>
+        <w:t xml:space="preserve">                                 </w:t>
+      </w:r>
+      <w:r>
+        <w:rPr>
+          <w:rStyle w:val="CommentTok"/>
+        </w:rPr>
+        <w:t xml:space="preserve"># inside Quarto documents</w:t>
       </w:r>
       <w:r>
         <w:br/>
@@ -1369,7 +1774,22 @@
         <w:rPr>
           <w:rStyle w:val="CommentTok"/>
         </w:rPr>
-        <w:t xml:space="preserve"># extend kable() with styling, spanning headers, and more</w:t>
+        <w:t xml:space="preserve"># extend kable() with styling,</w:t>
+      </w:r>
+      <w:r>
+        <w:br/>
+      </w:r>
+      <w:r>
+        <w:rPr>
+          <w:rStyle w:val="NormalTok"/>
+        </w:rPr>
+        <w:t xml:space="preserve">                                 </w:t>
+      </w:r>
+      <w:r>
+        <w:rPr>
+          <w:rStyle w:val="CommentTok"/>
+        </w:rPr>
+        <w:t xml:space="preserve"># spanning headers, and more</w:t>
       </w:r>
       <w:r>
         <w:br/>
@@ -1402,7 +1822,22 @@
         <w:rPr>
           <w:rStyle w:val="CommentTok"/>
         </w:rPr>
-        <w:t xml:space="preserve"># minimal, fast tables designed for Quarto</w:t>
+        <w:t xml:space="preserve"># minimal, fast tables</w:t>
+      </w:r>
+      <w:r>
+        <w:br/>
+      </w:r>
+      <w:r>
+        <w:rPr>
+          <w:rStyle w:val="NormalTok"/>
+        </w:rPr>
+        <w:t xml:space="preserve">                                 </w:t>
+      </w:r>
+      <w:r>
+        <w:rPr>
+          <w:rStyle w:val="CommentTok"/>
+        </w:rPr>
+        <w:t xml:space="preserve"># designed for Quarto</w:t>
       </w:r>
       <w:r>
         <w:br/>
@@ -1435,7 +1870,22 @@
         <w:rPr>
           <w:rStyle w:val="CommentTok"/>
         </w:rPr>
-        <w:t xml:space="preserve"># tables that export to Word, LaTeX, and HTML</w:t>
+        <w:t xml:space="preserve"># tables that export to</w:t>
+      </w:r>
+      <w:r>
+        <w:br/>
+      </w:r>
+      <w:r>
+        <w:rPr>
+          <w:rStyle w:val="NormalTok"/>
+        </w:rPr>
+        <w:t xml:space="preserve">                                 </w:t>
+      </w:r>
+      <w:r>
+        <w:rPr>
+          <w:rStyle w:val="CommentTok"/>
+        </w:rPr>
+        <w:t xml:space="preserve"># Word, LaTeX, and HTML</w:t>
       </w:r>
       <w:r>
         <w:br/>
@@ -1468,7 +1918,22 @@
         <w:rPr>
           <w:rStyle w:val="CommentTok"/>
         </w:rPr>
-        <w:t xml:space="preserve"># read and write Word and PowerPoint files from R</w:t>
+        <w:t xml:space="preserve"># read and write Word and</w:t>
+      </w:r>
+      <w:r>
+        <w:br/>
+      </w:r>
+      <w:r>
+        <w:rPr>
+          <w:rStyle w:val="NormalTok"/>
+        </w:rPr>
+        <w:t xml:space="preserve">                                 </w:t>
+      </w:r>
+      <w:r>
+        <w:rPr>
+          <w:rStyle w:val="CommentTok"/>
+        </w:rPr>
+        <w:t xml:space="preserve"># PowerPoint files from R</w:t>
       </w:r>
       <w:r>
         <w:br/>
@@ -1501,7 +1966,37 @@
         <w:rPr>
           <w:rStyle w:val="CommentTok"/>
         </w:rPr>
-        <w:t xml:space="preserve"># screenshot HTML widgets to PNG (required by some table packages)</w:t>
+        <w:t xml:space="preserve"># screenshot HTML widgets</w:t>
+      </w:r>
+      <w:r>
+        <w:br/>
+      </w:r>
+      <w:r>
+        <w:rPr>
+          <w:rStyle w:val="NormalTok"/>
+        </w:rPr>
+        <w:t xml:space="preserve">                                 </w:t>
+      </w:r>
+      <w:r>
+        <w:rPr>
+          <w:rStyle w:val="CommentTok"/>
+        </w:rPr>
+        <w:t xml:space="preserve"># to PNG (required by</w:t>
+      </w:r>
+      <w:r>
+        <w:br/>
+      </w:r>
+      <w:r>
+        <w:rPr>
+          <w:rStyle w:val="NormalTok"/>
+        </w:rPr>
+        <w:t xml:space="preserve">                                 </w:t>
+      </w:r>
+      <w:r>
+        <w:rPr>
+          <w:rStyle w:val="CommentTok"/>
+        </w:rPr>
+        <w:t xml:space="preserve"># some table packages)</w:t>
       </w:r>
       <w:r>
         <w:br/>
@@ -1534,7 +2029,22 @@
         <w:rPr>
           <w:rStyle w:val="CommentTok"/>
         </w:rPr>
-        <w:t xml:space="preserve"># R interface to the pandoc document converter</w:t>
+        <w:t xml:space="preserve"># R interface to the pandoc</w:t>
+      </w:r>
+      <w:r>
+        <w:br/>
+      </w:r>
+      <w:r>
+        <w:rPr>
+          <w:rStyle w:val="NormalTok"/>
+        </w:rPr>
+        <w:t xml:space="preserve">                                 </w:t>
+      </w:r>
+      <w:r>
+        <w:rPr>
+          <w:rStyle w:val="CommentTok"/>
+        </w:rPr>
+        <w:t xml:space="preserve"># document converter</w:t>
       </w:r>
     </w:p>
     <w:p>
@@ -1586,7 +2096,22 @@
         <w:rPr>
           <w:rStyle w:val="CommentTok"/>
         </w:rPr>
-        <w:t xml:space="preserve"># (already in Core — listed again for reference)</w:t>
+        <w:t xml:space="preserve"># (already in Core — listed</w:t>
+      </w:r>
+      <w:r>
+        <w:br/>
+      </w:r>
+      <w:r>
+        <w:rPr>
+          <w:rStyle w:val="NormalTok"/>
+        </w:rPr>
+        <w:t xml:space="preserve">                                 </w:t>
+      </w:r>
+      <w:r>
+        <w:rPr>
+          <w:rStyle w:val="CommentTok"/>
+        </w:rPr>
+        <w:t xml:space="preserve"># again for reference)</w:t>
       </w:r>
       <w:r>
         <w:br/>
@@ -1619,7 +2144,22 @@
         <w:rPr>
           <w:rStyle w:val="CommentTok"/>
         </w:rPr>
-        <w:t xml:space="preserve"># write to Excel without Java or other dependencies</w:t>
+        <w:t xml:space="preserve"># write to Excel without</w:t>
+      </w:r>
+      <w:r>
+        <w:br/>
+      </w:r>
+      <w:r>
+        <w:rPr>
+          <w:rStyle w:val="NormalTok"/>
+        </w:rPr>
+        <w:t xml:space="preserve">                                 </w:t>
+      </w:r>
+      <w:r>
+        <w:rPr>
+          <w:rStyle w:val="CommentTok"/>
+        </w:rPr>
+        <w:t xml:space="preserve"># Java or other dependencies</w:t>
       </w:r>
       <w:r>
         <w:br/>
@@ -1652,7 +2192,22 @@
         <w:rPr>
           <w:rStyle w:val="CommentTok"/>
         </w:rPr>
-        <w:t xml:space="preserve"># read/write Parquet and Feather files; very fast large data</w:t>
+        <w:t xml:space="preserve"># read/write Parquet and Feather</w:t>
+      </w:r>
+      <w:r>
+        <w:br/>
+      </w:r>
+      <w:r>
+        <w:rPr>
+          <w:rStyle w:val="NormalTok"/>
+        </w:rPr>
+        <w:t xml:space="preserve">                                 </w:t>
+      </w:r>
+      <w:r>
+        <w:rPr>
+          <w:rStyle w:val="CommentTok"/>
+        </w:rPr>
+        <w:t xml:space="preserve"># files; very fast large data</w:t>
       </w:r>
       <w:r>
         <w:br/>
@@ -1685,7 +2240,37 @@
         <w:rPr>
           <w:rStyle w:val="CommentTok"/>
         </w:rPr>
-        <w:t xml:space="preserve"># run SQL queries on data frames and Parquet files directly in R</w:t>
+        <w:t xml:space="preserve"># run SQL queries on data</w:t>
+      </w:r>
+      <w:r>
+        <w:br/>
+      </w:r>
+      <w:r>
+        <w:rPr>
+          <w:rStyle w:val="NormalTok"/>
+        </w:rPr>
+        <w:t xml:space="preserve">                                 </w:t>
+      </w:r>
+      <w:r>
+        <w:rPr>
+          <w:rStyle w:val="CommentTok"/>
+        </w:rPr>
+        <w:t xml:space="preserve"># frames and Parquet</w:t>
+      </w:r>
+      <w:r>
+        <w:br/>
+      </w:r>
+      <w:r>
+        <w:rPr>
+          <w:rStyle w:val="NormalTok"/>
+        </w:rPr>
+        <w:t xml:space="preserve">                                 </w:t>
+      </w:r>
+      <w:r>
+        <w:rPr>
+          <w:rStyle w:val="CommentTok"/>
+        </w:rPr>
+        <w:t xml:space="preserve"># files directly in R</w:t>
       </w:r>
     </w:p>
     <w:p>
@@ -1745,7 +2330,22 @@
         <w:rPr>
           <w:rStyle w:val="CommentTok"/>
         </w:rPr>
-        <w:t xml:space="preserve"># (already in Core) skim() gives a fast distributional overview</w:t>
+        <w:t xml:space="preserve"># (already in Core) skim() gives</w:t>
+      </w:r>
+      <w:r>
+        <w:br/>
+      </w:r>
+      <w:r>
+        <w:rPr>
+          <w:rStyle w:val="NormalTok"/>
+        </w:rPr>
+        <w:t xml:space="preserve">                                 </w:t>
+      </w:r>
+      <w:r>
+        <w:rPr>
+          <w:rStyle w:val="CommentTok"/>
+        </w:rPr>
+        <w:t xml:space="preserve"># a fast distributional overview</w:t>
       </w:r>
       <w:r>
         <w:br/>
@@ -1778,7 +2378,22 @@
         <w:rPr>
           <w:rStyle w:val="CommentTok"/>
         </w:rPr>
-        <w:t xml:space="preserve"># describe(), pairs.panels(), alpha() for scale reliability</w:t>
+        <w:t xml:space="preserve"># describe(), pairs.panels(),</w:t>
+      </w:r>
+      <w:r>
+        <w:br/>
+      </w:r>
+      <w:r>
+        <w:rPr>
+          <w:rStyle w:val="NormalTok"/>
+        </w:rPr>
+        <w:t xml:space="preserve">                                 </w:t>
+      </w:r>
+      <w:r>
+        <w:rPr>
+          <w:rStyle w:val="CommentTok"/>
+        </w:rPr>
+        <w:t xml:space="preserve"># alpha() for scale reliability</w:t>
       </w:r>
       <w:r>
         <w:br/>
@@ -1811,7 +2426,37 @@
         <w:rPr>
           <w:rStyle w:val="CommentTok"/>
         </w:rPr>
-        <w:t xml:space="preserve"># rcorr(), and a large collection of utility functions</w:t>
+        <w:t xml:space="preserve"># rcorr(), and a</w:t>
+      </w:r>
+      <w:r>
+        <w:br/>
+      </w:r>
+      <w:r>
+        <w:rPr>
+          <w:rStyle w:val="NormalTok"/>
+        </w:rPr>
+        <w:t xml:space="preserve">                                 </w:t>
+      </w:r>
+      <w:r>
+        <w:rPr>
+          <w:rStyle w:val="CommentTok"/>
+        </w:rPr>
+        <w:t xml:space="preserve"># large collection of</w:t>
+      </w:r>
+      <w:r>
+        <w:br/>
+      </w:r>
+      <w:r>
+        <w:rPr>
+          <w:rStyle w:val="NormalTok"/>
+        </w:rPr>
+        <w:t xml:space="preserve">                                 </w:t>
+      </w:r>
+      <w:r>
+        <w:rPr>
+          <w:rStyle w:val="CommentTok"/>
+        </w:rPr>
+        <w:t xml:space="preserve"># utility functions</w:t>
       </w:r>
       <w:r>
         <w:br/>
@@ -1877,7 +2522,22 @@
         <w:rPr>
           <w:rStyle w:val="CommentTok"/>
         </w:rPr>
-        <w:t xml:space="preserve"># Dunn test, length-frequency analysis, age-bias plots</w:t>
+        <w:t xml:space="preserve"># Dunn test, length-frequency</w:t>
+      </w:r>
+      <w:r>
+        <w:br/>
+      </w:r>
+      <w:r>
+        <w:rPr>
+          <w:rStyle w:val="NormalTok"/>
+        </w:rPr>
+        <w:t xml:space="preserve">                                 </w:t>
+      </w:r>
+      <w:r>
+        <w:rPr>
+          <w:rStyle w:val="CommentTok"/>
+        </w:rPr>
+        <w:t xml:space="preserve"># analysis, age-bias plots</w:t>
       </w:r>
     </w:p>
     <w:p>
@@ -1938,7 +2598,22 @@
         <w:rPr>
           <w:rStyle w:val="CommentTok"/>
         </w:rPr>
-        <w:t xml:space="preserve"># Anova() with Type II/III SS; leveneTest(); vif()</w:t>
+        <w:t xml:space="preserve"># Anova() with Type II/III</w:t>
+      </w:r>
+      <w:r>
+        <w:br/>
+      </w:r>
+      <w:r>
+        <w:rPr>
+          <w:rStyle w:val="NormalTok"/>
+        </w:rPr>
+        <w:t xml:space="preserve">                                 </w:t>
+      </w:r>
+      <w:r>
+        <w:rPr>
+          <w:rStyle w:val="CommentTok"/>
+        </w:rPr>
+        <w:t xml:space="preserve"># SS; leveneTest(); vif()</w:t>
       </w:r>
       <w:r>
         <w:br/>
@@ -1971,7 +2646,22 @@
         <w:rPr>
           <w:rStyle w:val="CommentTok"/>
         </w:rPr>
-        <w:t xml:space="preserve"># tidy(), glance(), augment() — model output as tibbles</w:t>
+        <w:t xml:space="preserve"># tidy(), glance(), augment()</w:t>
+      </w:r>
+      <w:r>
+        <w:br/>
+      </w:r>
+      <w:r>
+        <w:rPr>
+          <w:rStyle w:val="NormalTok"/>
+        </w:rPr>
+        <w:t xml:space="preserve">                                 </w:t>
+      </w:r>
+      <w:r>
+        <w:rPr>
+          <w:rStyle w:val="CommentTok"/>
+        </w:rPr>
+        <w:t xml:space="preserve"># — model output as tibbles</w:t>
       </w:r>
       <w:r>
         <w:br/>
@@ -2004,7 +2694,22 @@
         <w:rPr>
           <w:rStyle w:val="CommentTok"/>
         </w:rPr>
-        <w:t xml:space="preserve"># estimated marginal means and pairwise contrasts</w:t>
+        <w:t xml:space="preserve"># estimated marginal means</w:t>
+      </w:r>
+      <w:r>
+        <w:br/>
+      </w:r>
+      <w:r>
+        <w:rPr>
+          <w:rStyle w:val="NormalTok"/>
+        </w:rPr>
+        <w:t xml:space="preserve">                                 </w:t>
+      </w:r>
+      <w:r>
+        <w:rPr>
+          <w:rStyle w:val="CommentTok"/>
+        </w:rPr>
+        <w:t xml:space="preserve"># and pairwise contrasts</w:t>
       </w:r>
       <w:r>
         <w:br/>
@@ -2037,7 +2742,7 @@
         <w:rPr>
           <w:rStyle w:val="CommentTok"/>
         </w:rPr>
-        <w:t xml:space="preserve"># compact letter display for pairwise comparisons</w:t>
+        <w:t xml:space="preserve"># compact letter display</w:t>
       </w:r>
       <w:r>
         <w:br/>
@@ -2052,6 +2757,21 @@
         <w:rPr>
           <w:rStyle w:val="CommentTok"/>
         </w:rPr>
+        <w:t xml:space="preserve"># for pairwise comparisons</w:t>
+      </w:r>
+      <w:r>
+        <w:br/>
+      </w:r>
+      <w:r>
+        <w:rPr>
+          <w:rStyle w:val="NormalTok"/>
+        </w:rPr>
+        <w:t xml:space="preserve">                                 </w:t>
+      </w:r>
+      <w:r>
+        <w:rPr>
+          <w:rStyle w:val="CommentTok"/>
+        </w:rPr>
         <w:t xml:space="preserve"># </w:t>
       </w:r>
       <w:r>
@@ -2064,7 +2784,22 @@
         <w:rPr>
           <w:rStyle w:val="CommentTok"/>
         </w:rPr>
-        <w:t xml:space="preserve">: can mask some dplyr functions — load with care</w:t>
+        <w:t xml:space="preserve">: can mask some dplyr</w:t>
+      </w:r>
+      <w:r>
+        <w:br/>
+      </w:r>
+      <w:r>
+        <w:rPr>
+          <w:rStyle w:val="NormalTok"/>
+        </w:rPr>
+        <w:t xml:space="preserve">                                 </w:t>
+      </w:r>
+      <w:r>
+        <w:rPr>
+          <w:rStyle w:val="CommentTok"/>
+        </w:rPr>
+        <w:t xml:space="preserve"># functions — load with care</w:t>
       </w:r>
       <w:r>
         <w:br/>
@@ -2097,7 +2832,22 @@
         <w:rPr>
           <w:rStyle w:val="CommentTok"/>
         </w:rPr>
-        <w:t xml:space="preserve"># summarySE() for mean ± SE tables</w:t>
+        <w:t xml:space="preserve"># summarySE() for</w:t>
+      </w:r>
+      <w:r>
+        <w:br/>
+      </w:r>
+      <w:r>
+        <w:rPr>
+          <w:rStyle w:val="NormalTok"/>
+        </w:rPr>
+        <w:t xml:space="preserve">                                 </w:t>
+      </w:r>
+      <w:r>
+        <w:rPr>
+          <w:rStyle w:val="CommentTok"/>
+        </w:rPr>
+        <w:t xml:space="preserve"># mean ± SE tables</w:t>
       </w:r>
       <w:r>
         <w:br/>
@@ -2130,7 +2880,22 @@
         <w:rPr>
           <w:rStyle w:val="CommentTok"/>
         </w:rPr>
-        <w:t xml:space="preserve"># exact and permutation-based versions of common tests</w:t>
+        <w:t xml:space="preserve"># exact and permutation-based</w:t>
+      </w:r>
+      <w:r>
+        <w:br/>
+      </w:r>
+      <w:r>
+        <w:rPr>
+          <w:rStyle w:val="NormalTok"/>
+        </w:rPr>
+        <w:t xml:space="preserve">                                 </w:t>
+      </w:r>
+      <w:r>
+        <w:rPr>
+          <w:rStyle w:val="CommentTok"/>
+        </w:rPr>
+        <w:t xml:space="preserve"># versions of common tests</w:t>
       </w:r>
       <w:r>
         <w:br/>
@@ -2163,7 +2928,22 @@
         <w:rPr>
           <w:rStyle w:val="CommentTok"/>
         </w:rPr>
-        <w:t xml:space="preserve"># effect sizes and non-parametric summaries</w:t>
+        <w:t xml:space="preserve"># effect sizes and</w:t>
+      </w:r>
+      <w:r>
+        <w:br/>
+      </w:r>
+      <w:r>
+        <w:rPr>
+          <w:rStyle w:val="NormalTok"/>
+        </w:rPr>
+        <w:t xml:space="preserve">                                 </w:t>
+      </w:r>
+      <w:r>
+        <w:rPr>
+          <w:rStyle w:val="CommentTok"/>
+        </w:rPr>
+        <w:t xml:space="preserve"># non-parametric summaries</w:t>
       </w:r>
       <w:r>
         <w:br/>
@@ -2196,7 +2976,22 @@
         <w:rPr>
           <w:rStyle w:val="CommentTok"/>
         </w:rPr>
-        <w:t xml:space="preserve"># power analysis for t-tests, ANOVA, correlation, chi-square</w:t>
+        <w:t xml:space="preserve"># power analysis for t-tests,</w:t>
+      </w:r>
+      <w:r>
+        <w:br/>
+      </w:r>
+      <w:r>
+        <w:rPr>
+          <w:rStyle w:val="NormalTok"/>
+        </w:rPr>
+        <w:t xml:space="preserve">                                 </w:t>
+      </w:r>
+      <w:r>
+        <w:rPr>
+          <w:rStyle w:val="CommentTok"/>
+        </w:rPr>
+        <w:t xml:space="preserve"># ANOVA, correlation, chi-square</w:t>
       </w:r>
       <w:r>
         <w:br/>
@@ -2282,7 +3077,22 @@
         <w:rPr>
           <w:rStyle w:val="CommentTok"/>
         </w:rPr>
-        <w:t xml:space="preserve"># (already listed) Type II/III ANOVA; assumption checks</w:t>
+        <w:t xml:space="preserve"># (already listed) Type II/III</w:t>
+      </w:r>
+      <w:r>
+        <w:br/>
+      </w:r>
+      <w:r>
+        <w:rPr>
+          <w:rStyle w:val="NormalTok"/>
+        </w:rPr>
+        <w:t xml:space="preserve">                                 </w:t>
+      </w:r>
+      <w:r>
+        <w:rPr>
+          <w:rStyle w:val="CommentTok"/>
+        </w:rPr>
+        <w:t xml:space="preserve"># ANOVA; assumption checks</w:t>
       </w:r>
       <w:r>
         <w:br/>
@@ -2315,7 +3125,37 @@
         <w:rPr>
           <w:rStyle w:val="CommentTok"/>
         </w:rPr>
-        <w:t xml:space="preserve"># aov_ez() for factorial ANOVA; handles repeated measures cleanly</w:t>
+        <w:t xml:space="preserve"># aov_ez() for factorial</w:t>
+      </w:r>
+      <w:r>
+        <w:br/>
+      </w:r>
+      <w:r>
+        <w:rPr>
+          <w:rStyle w:val="NormalTok"/>
+        </w:rPr>
+        <w:t xml:space="preserve">                                 </w:t>
+      </w:r>
+      <w:r>
+        <w:rPr>
+          <w:rStyle w:val="CommentTok"/>
+        </w:rPr>
+        <w:t xml:space="preserve"># ANOVA; handles repeated</w:t>
+      </w:r>
+      <w:r>
+        <w:br/>
+      </w:r>
+      <w:r>
+        <w:rPr>
+          <w:rStyle w:val="NormalTok"/>
+        </w:rPr>
+        <w:t xml:space="preserve">                                 </w:t>
+      </w:r>
+      <w:r>
+        <w:rPr>
+          <w:rStyle w:val="CommentTok"/>
+        </w:rPr>
+        <w:t xml:space="preserve"># measures cleanly</w:t>
       </w:r>
       <w:r>
         <w:br/>
@@ -2348,7 +3188,22 @@
         <w:rPr>
           <w:rStyle w:val="CommentTok"/>
         </w:rPr>
-        <w:t xml:space="preserve"># (already listed) pairwise comparisons after ANOVA</w:t>
+        <w:t xml:space="preserve"># (already listed) pairwise</w:t>
+      </w:r>
+      <w:r>
+        <w:br/>
+      </w:r>
+      <w:r>
+        <w:rPr>
+          <w:rStyle w:val="NormalTok"/>
+        </w:rPr>
+        <w:t xml:space="preserve">                                 </w:t>
+      </w:r>
+      <w:r>
+        <w:rPr>
+          <w:rStyle w:val="CommentTok"/>
+        </w:rPr>
+        <w:t xml:space="preserve"># comparisons after ANOVA</w:t>
       </w:r>
       <w:r>
         <w:br/>
@@ -2381,7 +3236,22 @@
         <w:rPr>
           <w:rStyle w:val="CommentTok"/>
         </w:rPr>
-        <w:t xml:space="preserve"># (already listed) letter displays for post-hoc tests</w:t>
+        <w:t xml:space="preserve"># (already listed) letter</w:t>
+      </w:r>
+      <w:r>
+        <w:br/>
+      </w:r>
+      <w:r>
+        <w:rPr>
+          <w:rStyle w:val="NormalTok"/>
+        </w:rPr>
+        <w:t xml:space="preserve">                                 </w:t>
+      </w:r>
+      <w:r>
+        <w:rPr>
+          <w:rStyle w:val="CommentTok"/>
+        </w:rPr>
+        <w:t xml:space="preserve"># displays for post-hoc tests</w:t>
       </w:r>
       <w:r>
         <w:br/>
@@ -2414,7 +3284,37 @@
         <w:rPr>
           <w:rStyle w:val="CommentTok"/>
         </w:rPr>
-        <w:t xml:space="preserve"># relative importance of predictors in multiple regression</w:t>
+        <w:t xml:space="preserve"># relative importance</w:t>
+      </w:r>
+      <w:r>
+        <w:br/>
+      </w:r>
+      <w:r>
+        <w:rPr>
+          <w:rStyle w:val="NormalTok"/>
+        </w:rPr>
+        <w:t xml:space="preserve">                                 </w:t>
+      </w:r>
+      <w:r>
+        <w:rPr>
+          <w:rStyle w:val="CommentTok"/>
+        </w:rPr>
+        <w:t xml:space="preserve"># of predictors in</w:t>
+      </w:r>
+      <w:r>
+        <w:br/>
+      </w:r>
+      <w:r>
+        <w:rPr>
+          <w:rStyle w:val="NormalTok"/>
+        </w:rPr>
+        <w:t xml:space="preserve">                                 </w:t>
+      </w:r>
+      <w:r>
+        <w:rPr>
+          <w:rStyle w:val="CommentTok"/>
+        </w:rPr>
+        <w:t xml:space="preserve"># multiple regression</w:t>
       </w:r>
       <w:r>
         <w:br/>
@@ -2447,7 +3347,22 @@
         <w:rPr>
           <w:rStyle w:val="CommentTok"/>
         </w:rPr>
-        <w:t xml:space="preserve"># (already listed) tidy model output</w:t>
+        <w:t xml:space="preserve"># (already listed)</w:t>
+      </w:r>
+      <w:r>
+        <w:br/>
+      </w:r>
+      <w:r>
+        <w:rPr>
+          <w:rStyle w:val="NormalTok"/>
+        </w:rPr>
+        <w:t xml:space="preserve">                                 </w:t>
+      </w:r>
+      <w:r>
+        <w:rPr>
+          <w:rStyle w:val="CommentTok"/>
+        </w:rPr>
+        <w:t xml:space="preserve"># tidy model output</w:t>
       </w:r>
     </w:p>
     <w:p>
@@ -2507,7 +3422,22 @@
         <w:rPr>
           <w:rStyle w:val="CommentTok"/>
         </w:rPr>
-        <w:t xml:space="preserve"># lmer() and glmer() — the core mixed-model engine in R</w:t>
+        <w:t xml:space="preserve"># lmer() and glmer() — the</w:t>
+      </w:r>
+      <w:r>
+        <w:br/>
+      </w:r>
+      <w:r>
+        <w:rPr>
+          <w:rStyle w:val="NormalTok"/>
+        </w:rPr>
+        <w:t xml:space="preserve">                                 </w:t>
+      </w:r>
+      <w:r>
+        <w:rPr>
+          <w:rStyle w:val="CommentTok"/>
+        </w:rPr>
+        <w:t xml:space="preserve"># core mixed-model engine in R</w:t>
       </w:r>
       <w:r>
         <w:br/>
@@ -2540,7 +3470,37 @@
         <w:rPr>
           <w:rStyle w:val="CommentTok"/>
         </w:rPr>
-        <w:t xml:space="preserve"># adds p-values to lmer() output (Satterthwaite degrees of freedom)</w:t>
+        <w:t xml:space="preserve"># adds p-values to lmer()</w:t>
+      </w:r>
+      <w:r>
+        <w:br/>
+      </w:r>
+      <w:r>
+        <w:rPr>
+          <w:rStyle w:val="NormalTok"/>
+        </w:rPr>
+        <w:t xml:space="preserve">                                 </w:t>
+      </w:r>
+      <w:r>
+        <w:rPr>
+          <w:rStyle w:val="CommentTok"/>
+        </w:rPr>
+        <w:t xml:space="preserve"># output (Satterthwaite</w:t>
+      </w:r>
+      <w:r>
+        <w:br/>
+      </w:r>
+      <w:r>
+        <w:rPr>
+          <w:rStyle w:val="NormalTok"/>
+        </w:rPr>
+        <w:t xml:space="preserve">                                 </w:t>
+      </w:r>
+      <w:r>
+        <w:rPr>
+          <w:rStyle w:val="CommentTok"/>
+        </w:rPr>
+        <w:t xml:space="preserve"># degrees of freedom)</w:t>
       </w:r>
       <w:r>
         <w:br/>
@@ -2573,7 +3533,22 @@
         <w:rPr>
           <w:rStyle w:val="CommentTok"/>
         </w:rPr>
-        <w:t xml:space="preserve"># tidy() and glance() for lme4 and nlme model objects</w:t>
+        <w:t xml:space="preserve"># tidy() and glance() for</w:t>
+      </w:r>
+      <w:r>
+        <w:br/>
+      </w:r>
+      <w:r>
+        <w:rPr>
+          <w:rStyle w:val="NormalTok"/>
+        </w:rPr>
+        <w:t xml:space="preserve">                                 </w:t>
+      </w:r>
+      <w:r>
+        <w:rPr>
+          <w:rStyle w:val="CommentTok"/>
+        </w:rPr>
+        <w:t xml:space="preserve"># lme4 and nlme model objects</w:t>
       </w:r>
       <w:r>
         <w:br/>
@@ -2606,7 +3581,37 @@
         <w:rPr>
           <w:rStyle w:val="CommentTok"/>
         </w:rPr>
-        <w:t xml:space="preserve"># (already listed) mixed_() wrapper for factorial mixed models</w:t>
+        <w:t xml:space="preserve"># (already listed)</w:t>
+      </w:r>
+      <w:r>
+        <w:br/>
+      </w:r>
+      <w:r>
+        <w:rPr>
+          <w:rStyle w:val="NormalTok"/>
+        </w:rPr>
+        <w:t xml:space="preserve">                                 </w:t>
+      </w:r>
+      <w:r>
+        <w:rPr>
+          <w:rStyle w:val="CommentTok"/>
+        </w:rPr>
+        <w:t xml:space="preserve"># mixed_() wrapper for</w:t>
+      </w:r>
+      <w:r>
+        <w:br/>
+      </w:r>
+      <w:r>
+        <w:rPr>
+          <w:rStyle w:val="NormalTok"/>
+        </w:rPr>
+        <w:t xml:space="preserve">                                 </w:t>
+      </w:r>
+      <w:r>
+        <w:rPr>
+          <w:rStyle w:val="CommentTok"/>
+        </w:rPr>
+        <w:t xml:space="preserve"># factorial mixed models</w:t>
       </w:r>
       <w:r>
         <w:br/>
@@ -2639,7 +3644,37 @@
         <w:rPr>
           <w:rStyle w:val="CommentTok"/>
         </w:rPr>
-        <w:t xml:space="preserve"># (already listed) contrasts and marginal means for mixed models</w:t>
+        <w:t xml:space="preserve"># (already listed)</w:t>
+      </w:r>
+      <w:r>
+        <w:br/>
+      </w:r>
+      <w:r>
+        <w:rPr>
+          <w:rStyle w:val="NormalTok"/>
+        </w:rPr>
+        <w:t xml:space="preserve">                                 </w:t>
+      </w:r>
+      <w:r>
+        <w:rPr>
+          <w:rStyle w:val="CommentTok"/>
+        </w:rPr>
+        <w:t xml:space="preserve"># contrasts and marginal</w:t>
+      </w:r>
+      <w:r>
+        <w:br/>
+      </w:r>
+      <w:r>
+        <w:rPr>
+          <w:rStyle w:val="NormalTok"/>
+        </w:rPr>
+        <w:t xml:space="preserve">                                 </w:t>
+      </w:r>
+      <w:r>
+        <w:rPr>
+          <w:rStyle w:val="CommentTok"/>
+        </w:rPr>
+        <w:t xml:space="preserve"># means for mixed models</w:t>
       </w:r>
       <w:r>
         <w:br/>
@@ -2672,7 +3707,22 @@
         <w:rPr>
           <w:rStyle w:val="CommentTok"/>
         </w:rPr>
-        <w:t xml:space="preserve"># R², ICC, and check_model() diagnostic plots</w:t>
+        <w:t xml:space="preserve"># R², ICC, and check_model()</w:t>
+      </w:r>
+      <w:r>
+        <w:br/>
+      </w:r>
+      <w:r>
+        <w:rPr>
+          <w:rStyle w:val="NormalTok"/>
+        </w:rPr>
+        <w:t xml:space="preserve">                                 </w:t>
+      </w:r>
+      <w:r>
+        <w:rPr>
+          <w:rStyle w:val="CommentTok"/>
+        </w:rPr>
+        <w:t xml:space="preserve"># diagnostic plots</w:t>
       </w:r>
       <w:r>
         <w:br/>
@@ -2705,7 +3755,22 @@
         <w:rPr>
           <w:rStyle w:val="CommentTok"/>
         </w:rPr>
-        <w:t xml:space="preserve"># visualisation companion to performance</w:t>
+        <w:t xml:space="preserve"># visualisation companion</w:t>
+      </w:r>
+      <w:r>
+        <w:br/>
+      </w:r>
+      <w:r>
+        <w:rPr>
+          <w:rStyle w:val="NormalTok"/>
+        </w:rPr>
+        <w:t xml:space="preserve">                                 </w:t>
+      </w:r>
+      <w:r>
+        <w:rPr>
+          <w:rStyle w:val="CommentTok"/>
+        </w:rPr>
+        <w:t xml:space="preserve"># to performance</w:t>
       </w:r>
       <w:r>
         <w:br/>
@@ -2738,7 +3803,22 @@
         <w:rPr>
           <w:rStyle w:val="CommentTok"/>
         </w:rPr>
-        <w:t xml:space="preserve"># plot_model() for fixed/random effects; tab_model() tables</w:t>
+        <w:t xml:space="preserve"># plot_model() for fixed/random</w:t>
+      </w:r>
+      <w:r>
+        <w:br/>
+      </w:r>
+      <w:r>
+        <w:rPr>
+          <w:rStyle w:val="NormalTok"/>
+        </w:rPr>
+        <w:t xml:space="preserve">                                 </w:t>
+      </w:r>
+      <w:r>
+        <w:rPr>
+          <w:rStyle w:val="CommentTok"/>
+        </w:rPr>
+        <w:t xml:space="preserve"># effects; tab_model() tables</w:t>
       </w:r>
     </w:p>
     <w:p>
@@ -2798,7 +3878,22 @@
         <w:rPr>
           <w:rStyle w:val="CommentTok"/>
         </w:rPr>
-        <w:t xml:space="preserve"># (already listed) Anova() works for GLMs too</w:t>
+        <w:t xml:space="preserve"># (already listed) Anova()</w:t>
+      </w:r>
+      <w:r>
+        <w:br/>
+      </w:r>
+      <w:r>
+        <w:rPr>
+          <w:rStyle w:val="NormalTok"/>
+        </w:rPr>
+        <w:t xml:space="preserve">                                 </w:t>
+      </w:r>
+      <w:r>
+        <w:rPr>
+          <w:rStyle w:val="CommentTok"/>
+        </w:rPr>
+        <w:t xml:space="preserve"># works for GLMs too</w:t>
       </w:r>
       <w:r>
         <w:br/>
@@ -2831,7 +3926,22 @@
         <w:rPr>
           <w:rStyle w:val="CommentTok"/>
         </w:rPr>
-        <w:t xml:space="preserve"># (already listed) tidy GLM output</w:t>
+        <w:t xml:space="preserve"># (already listed)</w:t>
+      </w:r>
+      <w:r>
+        <w:br/>
+      </w:r>
+      <w:r>
+        <w:rPr>
+          <w:rStyle w:val="NormalTok"/>
+        </w:rPr>
+        <w:t xml:space="preserve">                                 </w:t>
+      </w:r>
+      <w:r>
+        <w:rPr>
+          <w:rStyle w:val="CommentTok"/>
+        </w:rPr>
+        <w:t xml:space="preserve"># tidy GLM output</w:t>
       </w:r>
       <w:r>
         <w:br/>
@@ -2864,7 +3974,22 @@
         <w:rPr>
           <w:rStyle w:val="CommentTok"/>
         </w:rPr>
-        <w:t xml:space="preserve"># (already listed) marginal means on the response scale</w:t>
+        <w:t xml:space="preserve"># (already listed) marginal</w:t>
+      </w:r>
+      <w:r>
+        <w:br/>
+      </w:r>
+      <w:r>
+        <w:rPr>
+          <w:rStyle w:val="NormalTok"/>
+        </w:rPr>
+        <w:t xml:space="preserve">                                 </w:t>
+      </w:r>
+      <w:r>
+        <w:rPr>
+          <w:rStyle w:val="CommentTok"/>
+        </w:rPr>
+        <w:t xml:space="preserve"># means on the response scale</w:t>
       </w:r>
       <w:r>
         <w:br/>
@@ -2897,7 +4022,22 @@
         <w:rPr>
           <w:rStyle w:val="CommentTok"/>
         </w:rPr>
-        <w:t xml:space="preserve"># zero-inflated Poisson and negative-binomial GLMs</w:t>
+        <w:t xml:space="preserve"># zero-inflated Poisson and</w:t>
+      </w:r>
+      <w:r>
+        <w:br/>
+      </w:r>
+      <w:r>
+        <w:rPr>
+          <w:rStyle w:val="NormalTok"/>
+        </w:rPr>
+        <w:t xml:space="preserve">                                 </w:t>
+      </w:r>
+      <w:r>
+        <w:rPr>
+          <w:rStyle w:val="CommentTok"/>
+        </w:rPr>
+        <w:t xml:space="preserve"># negative-binomial GLMs</w:t>
       </w:r>
       <w:r>
         <w:br/>
@@ -2930,7 +4070,22 @@
         <w:rPr>
           <w:rStyle w:val="CommentTok"/>
         </w:rPr>
-        <w:t xml:space="preserve"># residual diagnostics for GLMs and GLMMs via simulation</w:t>
+        <w:t xml:space="preserve"># residual diagnostics for GLMs</w:t>
+      </w:r>
+      <w:r>
+        <w:br/>
+      </w:r>
+      <w:r>
+        <w:rPr>
+          <w:rStyle w:val="NormalTok"/>
+        </w:rPr>
+        <w:t xml:space="preserve">                                 </w:t>
+      </w:r>
+      <w:r>
+        <w:rPr>
+          <w:rStyle w:val="CommentTok"/>
+        </w:rPr>
+        <w:t xml:space="preserve"># and GLMMs via simulation</w:t>
       </w:r>
       <w:r>
         <w:br/>
@@ -2963,7 +4118,37 @@
         <w:rPr>
           <w:rStyle w:val="CommentTok"/>
         </w:rPr>
-        <w:t xml:space="preserve"># Hosmer-Lemeshow goodness-of-fit for logistic regression</w:t>
+        <w:t xml:space="preserve"># Hosmer-Lemeshow</w:t>
+      </w:r>
+      <w:r>
+        <w:br/>
+      </w:r>
+      <w:r>
+        <w:rPr>
+          <w:rStyle w:val="NormalTok"/>
+        </w:rPr>
+        <w:t xml:space="preserve">                                      </w:t>
+      </w:r>
+      <w:r>
+        <w:rPr>
+          <w:rStyle w:val="CommentTok"/>
+        </w:rPr>
+        <w:t xml:space="preserve"># goodness-of-fit for</w:t>
+      </w:r>
+      <w:r>
+        <w:br/>
+      </w:r>
+      <w:r>
+        <w:rPr>
+          <w:rStyle w:val="NormalTok"/>
+        </w:rPr>
+        <w:t xml:space="preserve">                                      </w:t>
+      </w:r>
+      <w:r>
+        <w:rPr>
+          <w:rStyle w:val="CommentTok"/>
+        </w:rPr>
+        <w:t xml:space="preserve"># logistic regression</w:t>
       </w:r>
       <w:r>
         <w:br/>
@@ -2996,7 +4181,22 @@
         <w:rPr>
           <w:rStyle w:val="CommentTok"/>
         </w:rPr>
-        <w:t xml:space="preserve"># datasets and functions from Faraway's GLM textbook</w:t>
+        <w:t xml:space="preserve"># datasets and functions from</w:t>
+      </w:r>
+      <w:r>
+        <w:br/>
+      </w:r>
+      <w:r>
+        <w:rPr>
+          <w:rStyle w:val="NormalTok"/>
+        </w:rPr>
+        <w:t xml:space="preserve">                                 </w:t>
+      </w:r>
+      <w:r>
+        <w:rPr>
+          <w:rStyle w:val="CommentTok"/>
+        </w:rPr>
+        <w:t xml:space="preserve"># Faraway's GLM textbook</w:t>
       </w:r>
     </w:p>
     <w:p>
@@ -3048,7 +4248,22 @@
         <w:rPr>
           <w:rStyle w:val="CommentTok"/>
         </w:rPr>
-        <w:t xml:space="preserve"># dot-and-whisker coefficient plots for regression models</w:t>
+        <w:t xml:space="preserve"># dot-and-whisker coefficient</w:t>
+      </w:r>
+      <w:r>
+        <w:br/>
+      </w:r>
+      <w:r>
+        <w:rPr>
+          <w:rStyle w:val="NormalTok"/>
+        </w:rPr>
+        <w:t xml:space="preserve">                                 </w:t>
+      </w:r>
+      <w:r>
+        <w:rPr>
+          <w:rStyle w:val="CommentTok"/>
+        </w:rPr>
+        <w:t xml:space="preserve"># plots for regression models</w:t>
       </w:r>
       <w:r>
         <w:br/>
@@ -3081,7 +4296,22 @@
         <w:rPr>
           <w:rStyle w:val="CommentTok"/>
         </w:rPr>
-        <w:t xml:space="preserve"># autoplot() for lm, glm, PCA, time-series objects</w:t>
+        <w:t xml:space="preserve"># autoplot() for lm, glm,</w:t>
+      </w:r>
+      <w:r>
+        <w:br/>
+      </w:r>
+      <w:r>
+        <w:rPr>
+          <w:rStyle w:val="NormalTok"/>
+        </w:rPr>
+        <w:t xml:space="preserve">                                 </w:t>
+      </w:r>
+      <w:r>
+        <w:rPr>
+          <w:rStyle w:val="CommentTok"/>
+        </w:rPr>
+        <w:t xml:space="preserve"># PCA, time-series objects</w:t>
       </w:r>
       <w:r>
         <w:br/>
@@ -3114,7 +4344,22 @@
         <w:rPr>
           <w:rStyle w:val="CommentTok"/>
         </w:rPr>
-        <w:t xml:space="preserve"># interact_plot() and cat_plot() for interaction effects</w:t>
+        <w:t xml:space="preserve"># interact_plot() and cat_plot()</w:t>
+      </w:r>
+      <w:r>
+        <w:br/>
+      </w:r>
+      <w:r>
+        <w:rPr>
+          <w:rStyle w:val="NormalTok"/>
+        </w:rPr>
+        <w:t xml:space="preserve">                                 </w:t>
+      </w:r>
+      <w:r>
+        <w:rPr>
+          <w:rStyle w:val="CommentTok"/>
+        </w:rPr>
+        <w:t xml:space="preserve"># for interaction effects</w:t>
       </w:r>
       <w:r>
         <w:br/>
@@ -3147,7 +4392,22 @@
         <w:rPr>
           <w:rStyle w:val="CommentTok"/>
         </w:rPr>
-        <w:t xml:space="preserve"># (already listed) compare model fit, check assumptions</w:t>
+        <w:t xml:space="preserve"># (already listed) compare</w:t>
+      </w:r>
+      <w:r>
+        <w:br/>
+      </w:r>
+      <w:r>
+        <w:rPr>
+          <w:rStyle w:val="NormalTok"/>
+        </w:rPr>
+        <w:t xml:space="preserve">                                 </w:t>
+      </w:r>
+      <w:r>
+        <w:rPr>
+          <w:rStyle w:val="CommentTok"/>
+        </w:rPr>
+        <w:t xml:space="preserve"># model fit, check assumptions</w:t>
       </w:r>
       <w:r>
         <w:br/>
@@ -3180,7 +4440,22 @@
         <w:rPr>
           <w:rStyle w:val="CommentTok"/>
         </w:rPr>
-        <w:t xml:space="preserve"># (already listed) plots for performance outputs</w:t>
+        <w:t xml:space="preserve"># (already listed) plots</w:t>
+      </w:r>
+      <w:r>
+        <w:br/>
+      </w:r>
+      <w:r>
+        <w:rPr>
+          <w:rStyle w:val="NormalTok"/>
+        </w:rPr>
+        <w:t xml:space="preserve">                                 </w:t>
+      </w:r>
+      <w:r>
+        <w:rPr>
+          <w:rStyle w:val="CommentTok"/>
+        </w:rPr>
+        <w:t xml:space="preserve"># for performance outputs</w:t>
       </w:r>
       <w:r>
         <w:br/>
@@ -3213,7 +4488,22 @@
         <w:rPr>
           <w:rStyle w:val="CommentTok"/>
         </w:rPr>
-        <w:t xml:space="preserve"># sensitivity analysis for unmeasured confounding</w:t>
+        <w:t xml:space="preserve"># sensitivity analysis for</w:t>
+      </w:r>
+      <w:r>
+        <w:br/>
+      </w:r>
+      <w:r>
+        <w:rPr>
+          <w:rStyle w:val="NormalTok"/>
+        </w:rPr>
+        <w:t xml:space="preserve">                                 </w:t>
+      </w:r>
+      <w:r>
+        <w:rPr>
+          <w:rStyle w:val="CommentTok"/>
+        </w:rPr>
+        <w:t xml:space="preserve"># unmeasured confounding</w:t>
       </w:r>
     </w:p>
     <w:p>
@@ -3265,7 +4555,22 @@
         <w:rPr>
           <w:rStyle w:val="CommentTok"/>
         </w:rPr>
-        <w:t xml:space="preserve"># visualise correlation matrices as coloured grids or circles</w:t>
+        <w:t xml:space="preserve"># visualise correlation matrices</w:t>
+      </w:r>
+      <w:r>
+        <w:br/>
+      </w:r>
+      <w:r>
+        <w:rPr>
+          <w:rStyle w:val="NormalTok"/>
+        </w:rPr>
+        <w:t xml:space="preserve">                                 </w:t>
+      </w:r>
+      <w:r>
+        <w:rPr>
+          <w:rStyle w:val="CommentTok"/>
+        </w:rPr>
+        <w:t xml:space="preserve"># as coloured grids or circles</w:t>
       </w:r>
       <w:r>
         <w:br/>
@@ -3298,7 +4603,22 @@
         <w:rPr>
           <w:rStyle w:val="CommentTok"/>
         </w:rPr>
-        <w:t xml:space="preserve"># ggpairs() scatterplot matrix; ggcoef() coefficient plots</w:t>
+        <w:t xml:space="preserve"># ggpairs() scatterplot matrix;</w:t>
+      </w:r>
+      <w:r>
+        <w:br/>
+      </w:r>
+      <w:r>
+        <w:rPr>
+          <w:rStyle w:val="NormalTok"/>
+        </w:rPr>
+        <w:t xml:space="preserve">                                 </w:t>
+      </w:r>
+      <w:r>
+        <w:rPr>
+          <w:rStyle w:val="CommentTok"/>
+        </w:rPr>
+        <w:t xml:space="preserve"># ggcoef() coefficient plots</w:t>
       </w:r>
       <w:r>
         <w:br/>
@@ -3331,7 +4651,22 @@
         <w:rPr>
           <w:rStyle w:val="CommentTok"/>
         </w:rPr>
-        <w:t xml:space="preserve"># (already listed) polychoric / tetrachoric correlations</w:t>
+        <w:t xml:space="preserve"># (already listed) polychoric</w:t>
+      </w:r>
+      <w:r>
+        <w:br/>
+      </w:r>
+      <w:r>
+        <w:rPr>
+          <w:rStyle w:val="NormalTok"/>
+        </w:rPr>
+        <w:t xml:space="preserve">                                 </w:t>
+      </w:r>
+      <w:r>
+        <w:rPr>
+          <w:rStyle w:val="CommentTok"/>
+        </w:rPr>
+        <w:t xml:space="preserve"># / tetrachoric correlations</w:t>
       </w:r>
       <w:r>
         <w:br/>
@@ -3364,7 +4699,22 @@
         <w:rPr>
           <w:rStyle w:val="CommentTok"/>
         </w:rPr>
-        <w:t xml:space="preserve"># PCA, CA, MCA — full-featured multivariate methods</w:t>
+        <w:t xml:space="preserve"># PCA, CA, MCA — full-featured</w:t>
+      </w:r>
+      <w:r>
+        <w:br/>
+      </w:r>
+      <w:r>
+        <w:rPr>
+          <w:rStyle w:val="NormalTok"/>
+        </w:rPr>
+        <w:t xml:space="preserve">                                 </w:t>
+      </w:r>
+      <w:r>
+        <w:rPr>
+          <w:rStyle w:val="CommentTok"/>
+        </w:rPr>
+        <w:t xml:space="preserve"># multivariate methods</w:t>
       </w:r>
       <w:r>
         <w:br/>
@@ -3397,7 +4747,22 @@
         <w:rPr>
           <w:rStyle w:val="CommentTok"/>
         </w:rPr>
-        <w:t xml:space="preserve"># ggplot-based biplots and scree plots for FactoMineR / prcomp</w:t>
+        <w:t xml:space="preserve"># ggplot-based biplots and scree</w:t>
+      </w:r>
+      <w:r>
+        <w:br/>
+      </w:r>
+      <w:r>
+        <w:rPr>
+          <w:rStyle w:val="NormalTok"/>
+        </w:rPr>
+        <w:t xml:space="preserve">                                 </w:t>
+      </w:r>
+      <w:r>
+        <w:rPr>
+          <w:rStyle w:val="CommentTok"/>
+        </w:rPr>
+        <w:t xml:space="preserve"># plots for FactoMineR / prcomp</w:t>
       </w:r>
     </w:p>
     <w:p>
@@ -3449,7 +4814,22 @@
         <w:rPr>
           <w:rStyle w:val="CommentTok"/>
         </w:rPr>
-        <w:t xml:space="preserve"># NMDS, PERMANOVA (adonis2), diversity indices, ordination</w:t>
+        <w:t xml:space="preserve"># NMDS, PERMANOVA (adonis2),</w:t>
+      </w:r>
+      <w:r>
+        <w:br/>
+      </w:r>
+      <w:r>
+        <w:rPr>
+          <w:rStyle w:val="NormalTok"/>
+        </w:rPr>
+        <w:t xml:space="preserve">                                 </w:t>
+      </w:r>
+      <w:r>
+        <w:rPr>
+          <w:rStyle w:val="CommentTok"/>
+        </w:rPr>
+        <w:t xml:space="preserve"># diversity indices, ordination</w:t>
       </w:r>
       <w:r>
         <w:br/>
@@ -3482,7 +4862,22 @@
         <w:rPr>
           <w:rStyle w:val="CommentTok"/>
         </w:rPr>
-        <w:t xml:space="preserve"># pairwise PERMANOVA and other ecology helpers</w:t>
+        <w:t xml:space="preserve"># pairwise PERMANOVA and</w:t>
+      </w:r>
+      <w:r>
+        <w:br/>
+      </w:r>
+      <w:r>
+        <w:rPr>
+          <w:rStyle w:val="NormalTok"/>
+        </w:rPr>
+        <w:t xml:space="preserve">                                  </w:t>
+      </w:r>
+      <w:r>
+        <w:rPr>
+          <w:rStyle w:val="CommentTok"/>
+        </w:rPr>
+        <w:t xml:space="preserve"># other ecology helpers</w:t>
       </w:r>
       <w:r>
         <w:br/>
@@ -3515,7 +4910,22 @@
         <w:rPr>
           <w:rStyle w:val="CommentTok"/>
         </w:rPr>
-        <w:t xml:space="preserve"># pairwise adonis2 (CRAN version)</w:t>
+        <w:t xml:space="preserve"># pairwise adonis2</w:t>
+      </w:r>
+      <w:r>
+        <w:br/>
+      </w:r>
+      <w:r>
+        <w:rPr>
+          <w:rStyle w:val="NormalTok"/>
+        </w:rPr>
+        <w:t xml:space="preserve">                                   </w:t>
+      </w:r>
+      <w:r>
+        <w:rPr>
+          <w:rStyle w:val="CommentTok"/>
+        </w:rPr>
+        <w:t xml:space="preserve"># (CRAN version)</w:t>
       </w:r>
     </w:p>
     <w:p>
@@ -3568,6 +4978,15 @@
           <w:rStyle w:val="NormalTok"/>
         </w:rPr>
         <w:t xml:space="preserve">(</w:t>
+      </w:r>
+      <w:r>
+        <w:br/>
+      </w:r>
+      <w:r>
+        <w:rPr>
+          <w:rStyle w:val="NormalTok"/>
+        </w:rPr>
+        <w:t xml:space="preserve">  </w:t>
       </w:r>
       <w:r>
         <w:rPr>
@@ -3631,7 +5050,22 @@
         <w:rPr>
           <w:rStyle w:val="CommentTok"/>
         </w:rPr>
-        <w:t xml:space="preserve"># simple features: the standard for vector spatial data in R</w:t>
+        <w:t xml:space="preserve"># simple features: the standard</w:t>
+      </w:r>
+      <w:r>
+        <w:br/>
+      </w:r>
+      <w:r>
+        <w:rPr>
+          <w:rStyle w:val="NormalTok"/>
+        </w:rPr>
+        <w:t xml:space="preserve">                                  </w:t>
+      </w:r>
+      <w:r>
+        <w:rPr>
+          <w:rStyle w:val="CommentTok"/>
+        </w:rPr>
+        <w:t xml:space="preserve"># for vector spatial data in R</w:t>
       </w:r>
       <w:r>
         <w:br/>
@@ -3664,7 +5098,37 @@
         <w:rPr>
           <w:rStyle w:val="CommentTok"/>
         </w:rPr>
-        <w:t xml:space="preserve"># download US Census TIGER shapefiles (states, counties, roads)</w:t>
+        <w:t xml:space="preserve"># download US Census TIGER</w:t>
+      </w:r>
+      <w:r>
+        <w:br/>
+      </w:r>
+      <w:r>
+        <w:rPr>
+          <w:rStyle w:val="NormalTok"/>
+        </w:rPr>
+        <w:t xml:space="preserve">                                  </w:t>
+      </w:r>
+      <w:r>
+        <w:rPr>
+          <w:rStyle w:val="CommentTok"/>
+        </w:rPr>
+        <w:t xml:space="preserve"># shapefiles (states,</w:t>
+      </w:r>
+      <w:r>
+        <w:br/>
+      </w:r>
+      <w:r>
+        <w:rPr>
+          <w:rStyle w:val="NormalTok"/>
+        </w:rPr>
+        <w:t xml:space="preserve">                                  </w:t>
+      </w:r>
+      <w:r>
+        <w:rPr>
+          <w:rStyle w:val="CommentTok"/>
+        </w:rPr>
+        <w:t xml:space="preserve"># counties, roads)</w:t>
       </w:r>
       <w:r>
         <w:br/>
@@ -3697,7 +5161,22 @@
         <w:rPr>
           <w:rStyle w:val="CommentTok"/>
         </w:rPr>
-        <w:t xml:space="preserve"># world country, coastline, and graticule shapefiles</w:t>
+        <w:t xml:space="preserve"># world country, coastline,</w:t>
+      </w:r>
+      <w:r>
+        <w:br/>
+      </w:r>
+      <w:r>
+        <w:rPr>
+          <w:rStyle w:val="NormalTok"/>
+        </w:rPr>
+        <w:t xml:space="preserve">                                  </w:t>
+      </w:r>
+      <w:r>
+        <w:rPr>
+          <w:rStyle w:val="CommentTok"/>
+        </w:rPr>
+        <w:t xml:space="preserve"># and graticule shapefiles</w:t>
       </w:r>
       <w:r>
         <w:br/>
@@ -3730,7 +5209,37 @@
         <w:rPr>
           <w:rStyle w:val="CommentTok"/>
         </w:rPr>
-        <w:t xml:space="preserve"># download OpenStreetMap features (roads, buildings, waterways)</w:t>
+        <w:t xml:space="preserve"># download OpenStreetMap</w:t>
+      </w:r>
+      <w:r>
+        <w:br/>
+      </w:r>
+      <w:r>
+        <w:rPr>
+          <w:rStyle w:val="NormalTok"/>
+        </w:rPr>
+        <w:t xml:space="preserve">                                  </w:t>
+      </w:r>
+      <w:r>
+        <w:rPr>
+          <w:rStyle w:val="CommentTok"/>
+        </w:rPr>
+        <w:t xml:space="preserve"># features (roads,</w:t>
+      </w:r>
+      <w:r>
+        <w:br/>
+      </w:r>
+      <w:r>
+        <w:rPr>
+          <w:rStyle w:val="NormalTok"/>
+        </w:rPr>
+        <w:t xml:space="preserve">                                  </w:t>
+      </w:r>
+      <w:r>
+        <w:rPr>
+          <w:rStyle w:val="CommentTok"/>
+        </w:rPr>
+        <w:t xml:space="preserve"># buildings, waterways)</w:t>
       </w:r>
       <w:r>
         <w:br/>
@@ -3763,7 +5272,22 @@
         <w:rPr>
           <w:rStyle w:val="CommentTok"/>
         </w:rPr>
-        <w:t xml:space="preserve"># blur, shadow, and glow effects on ggplot layers</w:t>
+        <w:t xml:space="preserve"># blur, shadow, and glow</w:t>
+      </w:r>
+      <w:r>
+        <w:br/>
+      </w:r>
+      <w:r>
+        <w:rPr>
+          <w:rStyle w:val="NormalTok"/>
+        </w:rPr>
+        <w:t xml:space="preserve">                                  </w:t>
+      </w:r>
+      <w:r>
+        <w:rPr>
+          <w:rStyle w:val="CommentTok"/>
+        </w:rPr>
+        <w:t xml:space="preserve"># effects on ggplot layers</w:t>
       </w:r>
     </w:p>
     <w:p>
@@ -3845,25 +5369,52 @@
         <w:rPr>
           <w:rStyle w:val="CommentTok"/>
         </w:rPr>
-        <w:t xml:space="preserve"># rayshader  — render elevation data as 3D maps and raytraced scenes</w:t>
-      </w:r>
-      <w:r>
-        <w:br/>
-      </w:r>
-      <w:r>
-        <w:rPr>
-          <w:rStyle w:val="CommentTok"/>
-        </w:rPr>
-        <w:t xml:space="preserve"># elevatr    — download elevation rasters from AWS or OpenTopography</w:t>
-      </w:r>
-      <w:r>
-        <w:br/>
-      </w:r>
-      <w:r>
-        <w:rPr>
-          <w:rStyle w:val="CommentTok"/>
-        </w:rPr>
-        <w:t xml:space="preserve"># raster     — raster grid operations (legacy package; terra is the modern replacement)</w:t>
+        <w:t xml:space="preserve"># rayshader  — render elevation data</w:t>
+      </w:r>
+      <w:r>
+        <w:br/>
+      </w:r>
+      <w:r>
+        <w:rPr>
+          <w:rStyle w:val="CommentTok"/>
+        </w:rPr>
+        <w:t xml:space="preserve"># as 3D maps and raytraced scenes</w:t>
+      </w:r>
+      <w:r>
+        <w:br/>
+      </w:r>
+      <w:r>
+        <w:rPr>
+          <w:rStyle w:val="CommentTok"/>
+        </w:rPr>
+        <w:t xml:space="preserve"># elevatr    — download elevation</w:t>
+      </w:r>
+      <w:r>
+        <w:br/>
+      </w:r>
+      <w:r>
+        <w:rPr>
+          <w:rStyle w:val="CommentTok"/>
+        </w:rPr>
+        <w:t xml:space="preserve"># rasters from AWS or OpenTopography</w:t>
+      </w:r>
+      <w:r>
+        <w:br/>
+      </w:r>
+      <w:r>
+        <w:rPr>
+          <w:rStyle w:val="CommentTok"/>
+        </w:rPr>
+        <w:t xml:space="preserve"># raster     — raster grid operations (legacy</w:t>
+      </w:r>
+      <w:r>
+        <w:br/>
+      </w:r>
+      <w:r>
+        <w:rPr>
+          <w:rStyle w:val="CommentTok"/>
+        </w:rPr>
+        <w:t xml:space="preserve"># package; terra is the modern replacement)</w:t>
       </w:r>
     </w:p>
     <w:p>
@@ -3923,7 +5474,37 @@
         <w:rPr>
           <w:rStyle w:val="CommentTok"/>
         </w:rPr>
-        <w:t xml:space="preserve"># Palmer Archipelago penguin data — a tidy alternative to iris</w:t>
+        <w:t xml:space="preserve"># Palmer Archipelago</w:t>
+      </w:r>
+      <w:r>
+        <w:br/>
+      </w:r>
+      <w:r>
+        <w:rPr>
+          <w:rStyle w:val="NormalTok"/>
+        </w:rPr>
+        <w:t xml:space="preserve">                                   </w:t>
+      </w:r>
+      <w:r>
+        <w:rPr>
+          <w:rStyle w:val="CommentTok"/>
+        </w:rPr>
+        <w:t xml:space="preserve"># penguin data — a tidy</w:t>
+      </w:r>
+      <w:r>
+        <w:br/>
+      </w:r>
+      <w:r>
+        <w:rPr>
+          <w:rStyle w:val="NormalTok"/>
+        </w:rPr>
+        <w:t xml:space="preserve">                                   </w:t>
+      </w:r>
+      <w:r>
+        <w:rPr>
+          <w:rStyle w:val="CommentTok"/>
+        </w:rPr>
+        <w:t xml:space="preserve"># alternative to iris</w:t>
       </w:r>
       <w:r>
         <w:br/>
@@ -3956,7 +5537,22 @@
         <w:rPr>
           <w:rStyle w:val="CommentTok"/>
         </w:rPr>
-        <w:t xml:space="preserve"># 336,776 flights departing New York City in 2013</w:t>
+        <w:t xml:space="preserve"># 336,776 flights departing</w:t>
+      </w:r>
+      <w:r>
+        <w:br/>
+      </w:r>
+      <w:r>
+        <w:rPr>
+          <w:rStyle w:val="NormalTok"/>
+        </w:rPr>
+        <w:t xml:space="preserve">                                   </w:t>
+      </w:r>
+      <w:r>
+        <w:rPr>
+          <w:rStyle w:val="CommentTok"/>
+        </w:rPr>
+        <w:t xml:space="preserve"># New York City in 2013</w:t>
       </w:r>
       <w:r>
         <w:br/>
@@ -3989,7 +5585,22 @@
         <w:rPr>
           <w:rStyle w:val="CommentTok"/>
         </w:rPr>
-        <w:t xml:space="preserve"># Sean Lahman's complete baseball statistics database</w:t>
+        <w:t xml:space="preserve"># Sean Lahman's complete</w:t>
+      </w:r>
+      <w:r>
+        <w:br/>
+      </w:r>
+      <w:r>
+        <w:rPr>
+          <w:rStyle w:val="NormalTok"/>
+        </w:rPr>
+        <w:t xml:space="preserve">                                   </w:t>
+      </w:r>
+      <w:r>
+        <w:rPr>
+          <w:rStyle w:val="CommentTok"/>
+        </w:rPr>
+        <w:t xml:space="preserve"># baseball statistics database</w:t>
       </w:r>
       <w:r>
         <w:br/>
@@ -4022,7 +5633,22 @@
         <w:rPr>
           <w:rStyle w:val="CommentTok"/>
         </w:rPr>
-        <w:t xml:space="preserve"># US baby name counts and proportions, 1880–2017</w:t>
+        <w:t xml:space="preserve"># US baby name counts and</w:t>
+      </w:r>
+      <w:r>
+        <w:br/>
+      </w:r>
+      <w:r>
+        <w:rPr>
+          <w:rStyle w:val="NormalTok"/>
+        </w:rPr>
+        <w:t xml:space="preserve">                                   </w:t>
+      </w:r>
+      <w:r>
+        <w:rPr>
+          <w:rStyle w:val="CommentTok"/>
+        </w:rPr>
+        <w:t xml:space="preserve"># proportions, 1880–2017</w:t>
       </w:r>
       <w:r>
         <w:br/>
@@ -4055,7 +5681,22 @@
         <w:rPr>
           <w:rStyle w:val="CommentTok"/>
         </w:rPr>
-        <w:t xml:space="preserve"># nested list datasets for learning purrr and iteration</w:t>
+        <w:t xml:space="preserve"># nested list datasets for</w:t>
+      </w:r>
+      <w:r>
+        <w:br/>
+      </w:r>
+      <w:r>
+        <w:rPr>
+          <w:rStyle w:val="NormalTok"/>
+        </w:rPr>
+        <w:t xml:space="preserve">                                   </w:t>
+      </w:r>
+      <w:r>
+        <w:rPr>
+          <w:rStyle w:val="CommentTok"/>
+        </w:rPr>
+        <w:t xml:space="preserve"># learning purrr and iteration</w:t>
       </w:r>
     </w:p>
     <w:p>
@@ -4107,7 +5748,22 @@
         <w:rPr>
           <w:rStyle w:val="CommentTok"/>
         </w:rPr>
-        <w:t xml:space="preserve"># embed interactive HTML widgets in Quarto documents</w:t>
+        <w:t xml:space="preserve"># embed interactive HTML</w:t>
+      </w:r>
+      <w:r>
+        <w:br/>
+      </w:r>
+      <w:r>
+        <w:rPr>
+          <w:rStyle w:val="NormalTok"/>
+        </w:rPr>
+        <w:t xml:space="preserve">                                 </w:t>
+      </w:r>
+      <w:r>
+        <w:rPr>
+          <w:rStyle w:val="CommentTok"/>
+        </w:rPr>
+        <w:t xml:space="preserve"># widgets in Quarto documents</w:t>
       </w:r>
       <w:r>
         <w:br/>
@@ -4140,7 +5796,22 @@
         <w:rPr>
           <w:rStyle w:val="CommentTok"/>
         </w:rPr>
-        <w:t xml:space="preserve"># build and manipulate HTML output from R</w:t>
+        <w:t xml:space="preserve"># build and manipulate</w:t>
+      </w:r>
+      <w:r>
+        <w:br/>
+      </w:r>
+      <w:r>
+        <w:rPr>
+          <w:rStyle w:val="NormalTok"/>
+        </w:rPr>
+        <w:t xml:space="preserve">                                 </w:t>
+      </w:r>
+      <w:r>
+        <w:rPr>
+          <w:rStyle w:val="CommentTok"/>
+        </w:rPr>
+        <w:t xml:space="preserve"># HTML output from R</w:t>
       </w:r>
     </w:p>
     <w:p>
@@ -4192,7 +5863,7 @@
         <w:rPr>
           <w:rStyle w:val="CommentTok"/>
         </w:rPr>
-        <w:t xml:space="preserve"># ── CORE ──────────────────────────────────────────────────────────────────────</w:t>
+        <w:t xml:space="preserve"># ── CORE ───────────────────────────────────────────────────────</w:t>
       </w:r>
       <w:r>
         <w:br/>
@@ -4360,7 +6031,7 @@
         <w:rPr>
           <w:rStyle w:val="CommentTok"/>
         </w:rPr>
-        <w:t xml:space="preserve"># ── PLOTTING ──────────────────────────────────────────────────────────────────</w:t>
+        <w:t xml:space="preserve"># ── PLOTTING ───────────────────────────────────────────────────</w:t>
       </w:r>
       <w:r>
         <w:br/>
@@ -4654,7 +6325,7 @@
         <w:rPr>
           <w:rStyle w:val="CommentTok"/>
         </w:rPr>
-        <w:t xml:space="preserve"># ── TABLES ────────────────────────────────────────────────────────────────────</w:t>
+        <w:t xml:space="preserve"># ── TABLES ─────────────────────────────────────────────────────</w:t>
       </w:r>
       <w:r>
         <w:br/>
@@ -4822,7 +6493,7 @@
         <w:rPr>
           <w:rStyle w:val="CommentTok"/>
         </w:rPr>
-        <w:t xml:space="preserve"># ── DATA ──────────────────────────────────────────────────────────────────────</w:t>
+        <w:t xml:space="preserve"># ── DATA ───────────────────────────────────────────────────────</w:t>
       </w:r>
       <w:r>
         <w:br/>
@@ -4885,7 +6556,7 @@
         <w:rPr>
           <w:rStyle w:val="CommentTok"/>
         </w:rPr>
-        <w:t xml:space="preserve"># ── DESCRIPTIVE STATS ─────────────────────────────────────────────────────────</w:t>
+        <w:t xml:space="preserve"># ── DESCRIPTIVE STATS ──────────────────────────────────────────</w:t>
       </w:r>
       <w:r>
         <w:br/>
@@ -4972,7 +6643,7 @@
         <w:rPr>
           <w:rStyle w:val="CommentTok"/>
         </w:rPr>
-        <w:t xml:space="preserve"># ── STATISTICAL TESTS ─────────────────────────────────────────────────────────</w:t>
+        <w:t xml:space="preserve"># ── STATISTICAL TESTS ──────────────────────────────────────────</w:t>
       </w:r>
       <w:r>
         <w:br/>
@@ -5140,7 +6811,7 @@
         <w:rPr>
           <w:rStyle w:val="CommentTok"/>
         </w:rPr>
-        <w:t xml:space="preserve"># ── ANOVA &amp; LINEAR MODELS ─────────────────────────────────────────────────────</w:t>
+        <w:t xml:space="preserve"># ── ANOVA &amp; LINEAR MODELS ──────────────────────────────────────</w:t>
       </w:r>
       <w:r>
         <w:br/>
@@ -5203,7 +6874,7 @@
         <w:rPr>
           <w:rStyle w:val="CommentTok"/>
         </w:rPr>
-        <w:t xml:space="preserve"># ── MIXED MODELS ──────────────────────────────────────────────────────────────</w:t>
+        <w:t xml:space="preserve"># ── MIXED MODELS ───────────────────────────────────────────────</w:t>
       </w:r>
       <w:r>
         <w:br/>
@@ -5335,7 +7006,7 @@
         <w:rPr>
           <w:rStyle w:val="CommentTok"/>
         </w:rPr>
-        <w:t xml:space="preserve"># ── GLMS ──────────────────────────────────────────────────────────────────────</w:t>
+        <w:t xml:space="preserve"># ── GLMS ───────────────────────────────────────────────────────</w:t>
       </w:r>
       <w:r>
         <w:br/>
@@ -5434,7 +7105,7 @@
         <w:rPr>
           <w:rStyle w:val="CommentTok"/>
         </w:rPr>
-        <w:t xml:space="preserve"># ── MODEL VISUALISATION ───────────────────────────────────────────────────────</w:t>
+        <w:t xml:space="preserve"># ── MODEL VISUALISATION ────────────────────────────────────────</w:t>
       </w:r>
       <w:r>
         <w:br/>
@@ -5533,7 +7204,7 @@
         <w:rPr>
           <w:rStyle w:val="CommentTok"/>
         </w:rPr>
-        <w:t xml:space="preserve"># ── MULTIVARIATE ──────────────────────────────────────────────────────────────</w:t>
+        <w:t xml:space="preserve"># ── MULTIVARIATE ───────────────────────────────────────────────</w:t>
       </w:r>
       <w:r>
         <w:br/>
@@ -5695,6 +7366,15 @@
         <w:t xml:space="preserve">(</w:t>
       </w:r>
       <w:r>
+        <w:br/>
+      </w:r>
+      <w:r>
+        <w:rPr>
+          <w:rStyle w:val="NormalTok"/>
+        </w:rPr>
+        <w:t xml:space="preserve">  </w:t>
+      </w:r>
+      <w:r>
         <w:rPr>
           <w:rStyle w:val="StringTok"/>
         </w:rPr>
@@ -5716,7 +7396,7 @@
         <w:rPr>
           <w:rStyle w:val="CommentTok"/>
         </w:rPr>
-        <w:t xml:space="preserve"># ── MAPS ──────────────────────────────────────────────────────────────────────</w:t>
+        <w:t xml:space="preserve"># ── MAPS ───────────────────────────────────────────────────────</w:t>
       </w:r>
       <w:r>
         <w:br/>
@@ -5872,7 +7552,7 @@
         <w:rPr>
           <w:rStyle w:val="CommentTok"/>
         </w:rPr>
-        <w:t xml:space="preserve"># ── TEACHING DATASETS ─────────────────────────────────────────────────────────</w:t>
+        <w:t xml:space="preserve"># ── TEACHING DATASETS ──────────────────────────────────────────</w:t>
       </w:r>
       <w:r>
         <w:br/>
@@ -5956,7 +7636,16 @@
         <w:rPr>
           <w:rStyle w:val="NormalTok"/>
         </w:rPr>
-        <w:t xml:space="preserve">, </w:t>
+        <w:t xml:space="preserve">,</w:t>
+      </w:r>
+      <w:r>
+        <w:br/>
+      </w:r>
+      <w:r>
+        <w:rPr>
+          <w:rStyle w:val="NormalTok"/>
+        </w:rPr>
+        <w:t xml:space="preserve">  </w:t>
       </w:r>
       <w:r>
         <w:rPr>
@@ -5983,7 +7672,7 @@
         <w:rPr>
           <w:rStyle w:val="CommentTok"/>
         </w:rPr>
-        <w:t xml:space="preserve"># ── REPORTING ─────────────────────────────────────────────────────────────────</w:t>
+        <w:t xml:space="preserve"># ── REPORTING ──────────────────────────────────────────────────</w:t>
       </w:r>
       <w:r>
         <w:br/>

</xml_diff>